<commit_message>
Andrew Plotly Buttons Fix
</commit_message>
<xml_diff>
--- a/SOP.docx
+++ b/SOP.docx
@@ -153,10 +153,7 @@
         </w:numPr>
       </w:pPr>
       <w:r>
-        <w:t xml:space="preserve">Move all </w:t>
-      </w:r>
-      <w:r>
-        <w:t xml:space="preserve">DO and </w:t>
+        <w:t xml:space="preserve">Move all DO and </w:t>
       </w:r>
       <w:proofErr w:type="spellStart"/>
       <w:r>
@@ -234,17 +231,11 @@
       </w:r>
       <w:proofErr w:type="gramStart"/>
       <w:r>
-        <w:t xml:space="preserve">in </w:t>
-      </w:r>
-      <w:r>
-        <w:t xml:space="preserve"> \</w:t>
+        <w:t>in  \</w:t>
       </w:r>
       <w:proofErr w:type="gramEnd"/>
       <w:r>
-        <w:t>Striped-Bass-Habitat-Suitability</w:t>
-      </w:r>
-      <w:r>
-        <w:t xml:space="preserve"> into the folder you just created. </w:t>
+        <w:t xml:space="preserve">Striped-Bass-Habitat-Suitability into the folder you just created. </w:t>
       </w:r>
     </w:p>
     <w:p>
@@ -256,13 +247,7 @@
         </w:numPr>
       </w:pPr>
       <w:r>
-        <w:t xml:space="preserve">Move all GIS shape files in </w:t>
-      </w:r>
-      <w:r>
-        <w:t>\Striped-Bass-Habitat-Suitability</w:t>
-      </w:r>
-      <w:r>
-        <w:t>\</w:t>
+        <w:t>Move all GIS shape files in \Striped-Bass-Habitat-Suitability\</w:t>
       </w:r>
       <w:proofErr w:type="spellStart"/>
       <w:r>
@@ -270,27 +255,15 @@
       </w:r>
       <w:proofErr w:type="spellEnd"/>
       <w:r>
-        <w:t xml:space="preserve">, </w:t>
-      </w:r>
-      <w:r>
-        <w:t>\Striped-Bass-Habitat-Suitability\</w:t>
-      </w:r>
-      <w:proofErr w:type="spellStart"/>
-      <w:r>
-        <w:t>FishingArea</w:t>
-      </w:r>
-      <w:r>
-        <w:t>Quality</w:t>
-      </w:r>
-      <w:proofErr w:type="spellEnd"/>
-      <w:r>
-        <w:t xml:space="preserve"> and </w:t>
-      </w:r>
-      <w:r>
-        <w:t>\Striped-Bass-Habitat-Suitability</w:t>
-      </w:r>
-      <w:r>
-        <w:t>\</w:t>
+        <w:t>, \Striped-Bass-Habitat-Suitability\</w:t>
+      </w:r>
+      <w:proofErr w:type="spellStart"/>
+      <w:r>
+        <w:t>FishingAreaQuality</w:t>
+      </w:r>
+      <w:proofErr w:type="spellEnd"/>
+      <w:r>
+        <w:t xml:space="preserve"> and \Striped-Bass-Habitat-Suitability\</w:t>
       </w:r>
       <w:proofErr w:type="spellStart"/>
       <w:r>
@@ -551,7 +524,10 @@
         </w:numPr>
       </w:pPr>
       <w:r>
-        <w:t xml:space="preserve">Alternatively, you may run the VOL3D interpolator for DO and </w:t>
+        <w:t>In the event Andrew is not available</w:t>
+      </w:r>
+      <w:r>
+        <w:t xml:space="preserve">, you may run the VOL3D interpolator for DO and </w:t>
       </w:r>
       <w:proofErr w:type="spellStart"/>
       <w:r>
@@ -771,6 +747,17 @@
       <w:r>
         <w:t xml:space="preserve"> suitable habitat (blue). </w:t>
       </w:r>
+      <w:r>
+        <w:t xml:space="preserve">Save those two </w:t>
+      </w:r>
+      <w:proofErr w:type="spellStart"/>
+      <w:r>
+        <w:t>csvs</w:t>
+      </w:r>
+      <w:proofErr w:type="spellEnd"/>
+      <w:r>
+        <w:t>.</w:t>
+      </w:r>
     </w:p>
     <w:p>
       <w:pPr>
@@ -842,13 +829,13 @@
       <w:proofErr w:type="spellEnd"/>
       <w:proofErr w:type="gramEnd"/>
       <w:r>
-        <w:t xml:space="preserve"> in </w:t>
-      </w:r>
-      <w:r>
-        <w:t>\Striped-Bass-Habitat-Suitability</w:t>
-      </w:r>
-      <w:r>
-        <w:t xml:space="preserve">. Update line 33 with the current month’s cruise file. If in June, July or August, update 36 with “Late” or “Early”. If in any other months, leave the “” blank. </w:t>
+        <w:t xml:space="preserve"> in \Striped-Bass-Habitat-Suitability. Update line 33 with the current month’s cruise file. If in June, July or August, update</w:t>
+      </w:r>
+      <w:r>
+        <w:t xml:space="preserve"> line</w:t>
+      </w:r>
+      <w:r>
+        <w:t xml:space="preserve"> 36 with “Late” or “Early”. If in any other months, leave the “” blank. </w:t>
       </w:r>
     </w:p>
     <w:p>
@@ -1002,7 +989,21 @@
         <w:t xml:space="preserve">Navigate to the GitHub account hosting the </w:t>
       </w:r>
       <w:r>
-        <w:t xml:space="preserve">app and double check it has been updated. The new files will show up under your commit message in the repo. </w:t>
+        <w:t xml:space="preserve">app and double check it has been updated. The new files will </w:t>
+      </w:r>
+      <w:proofErr w:type="gramStart"/>
+      <w:r>
+        <w:t>show up</w:t>
+      </w:r>
+      <w:proofErr w:type="gramEnd"/>
+      <w:r>
+        <w:t xml:space="preserve"> </w:t>
+      </w:r>
+      <w:r>
+        <w:t>displaying</w:t>
+      </w:r>
+      <w:r>
+        <w:t xml:space="preserve"> your commit message in the repo. </w:t>
       </w:r>
     </w:p>
     <w:p>
@@ -1032,7 +1033,7 @@
         </w:rPr>
       </w:pPr>
       <w:r>
-        <w:t xml:space="preserve">Select ‘Republish’ on the left sidebar. This takes a few minutes to update. </w:t>
+        <w:t xml:space="preserve">Select ‘Republish’ on the left sidebar. This takes a minute to update. </w:t>
       </w:r>
     </w:p>
     <w:p>

</xml_diff>

<commit_message>
080426 SOP edits before pulling Klaus's changes for July.
</commit_message>
<xml_diff>
--- a/SOP.docx
+++ b/SOP.docx
@@ -1,6 +1,6 @@
 
 <file path=word/document.xml><?xml version="1.0" encoding="utf-8"?>
-<w:document xmlns:wpc="http://schemas.microsoft.com/office/word/2010/wordprocessingCanvas" xmlns:cx="http://schemas.microsoft.com/office/drawing/2014/chartex" xmlns:cx1="http://schemas.microsoft.com/office/drawing/2015/9/8/chartex" xmlns:cx2="http://schemas.microsoft.com/office/drawing/2015/10/21/chartex" xmlns:cx3="http://schemas.microsoft.com/office/drawing/2016/5/9/chartex" xmlns:cx4="http://schemas.microsoft.com/office/drawing/2016/5/10/chartex" xmlns:cx5="http://schemas.microsoft.com/office/drawing/2016/5/11/chartex" xmlns:cx6="http://schemas.microsoft.com/office/drawing/2016/5/12/chartex" xmlns:cx7="http://schemas.microsoft.com/office/drawing/2016/5/13/chartex" xmlns:cx8="http://schemas.microsoft.com/office/drawing/2016/5/14/chartex" xmlns:mc="http://schemas.openxmlformats.org/markup-compatibility/2006" xmlns:aink="http://schemas.microsoft.com/office/drawing/2016/ink" xmlns:am3d="http://schemas.microsoft.com/office/drawing/2017/model3d" xmlns:o="urn:schemas-microsoft-com:office:office" xmlns:oel="http://schemas.microsoft.com/office/2019/extlst" xmlns:r="http://schemas.openxmlformats.org/officeDocument/2006/relationships" xmlns:m="http://schemas.openxmlformats.org/officeDocument/2006/math" xmlns:v="urn:schemas-microsoft-com:vml" xmlns:wp14="http://schemas.microsoft.com/office/word/2010/wordprocessingDrawing" xmlns:wp="http://schemas.openxmlformats.org/drawingml/2006/wordprocessingDrawing" xmlns:w10="urn:schemas-microsoft-com:office:word" xmlns:w="http://schemas.openxmlformats.org/wordprocessingml/2006/main" xmlns:w14="http://schemas.microsoft.com/office/word/2010/wordml" xmlns:w15="http://schemas.microsoft.com/office/word/2012/wordml" xmlns:w16cex="http://schemas.microsoft.com/office/word/2018/wordml/cex" xmlns:w16cid="http://schemas.microsoft.com/office/word/2016/wordml/cid" xmlns:w16="http://schemas.microsoft.com/office/word/2018/wordml" xmlns:w16du="http://schemas.microsoft.com/office/word/2023/wordml/word16du" xmlns:w16sdtdh="http://schemas.microsoft.com/office/word/2020/wordml/sdtdatahash" xmlns:w16sdtfl="http://schemas.microsoft.com/office/word/2024/wordml/sdtformatlock" xmlns:w16se="http://schemas.microsoft.com/office/word/2015/wordml/symex" xmlns:wpg="http://schemas.microsoft.com/office/word/2010/wordprocessingGroup" xmlns:wpi="http://schemas.microsoft.com/office/word/2010/wordprocessingInk" xmlns:wne="http://schemas.microsoft.com/office/word/2006/wordml" xmlns:wps="http://schemas.microsoft.com/office/word/2010/wordprocessingShape" mc:Ignorable="w14 w15 w16se w16cid w16 w16cex w16sdtdh w16sdtfl w16du wp14">
+<w:document xmlns:wpc="http://schemas.microsoft.com/office/word/2010/wordprocessingCanvas" xmlns:cx="http://schemas.microsoft.com/office/drawing/2014/chartex" xmlns:cx1="http://schemas.microsoft.com/office/drawing/2015/9/8/chartex" xmlns:cx2="http://schemas.microsoft.com/office/drawing/2015/10/21/chartex" xmlns:cx3="http://schemas.microsoft.com/office/drawing/2016/5/9/chartex" xmlns:cx4="http://schemas.microsoft.com/office/drawing/2016/5/10/chartex" xmlns:cx5="http://schemas.microsoft.com/office/drawing/2016/5/11/chartex" xmlns:cx6="http://schemas.microsoft.com/office/drawing/2016/5/12/chartex" xmlns:cx7="http://schemas.microsoft.com/office/drawing/2016/5/13/chartex" xmlns:cx8="http://schemas.microsoft.com/office/drawing/2016/5/14/chartex" xmlns:mc="http://schemas.openxmlformats.org/markup-compatibility/2006" xmlns:aink="http://schemas.microsoft.com/office/drawing/2016/ink" xmlns:am3d="http://schemas.microsoft.com/office/drawing/2017/model3d" xmlns:o="urn:schemas-microsoft-com:office:office" xmlns:oel="http://schemas.microsoft.com/office/2019/extlst" xmlns:r="http://schemas.openxmlformats.org/officeDocument/2006/relationships" xmlns:m="http://schemas.openxmlformats.org/officeDocument/2006/math" xmlns:v="urn:schemas-microsoft-com:vml" xmlns:wp14="http://schemas.microsoft.com/office/word/2010/wordprocessingDrawing" xmlns:wp="http://schemas.openxmlformats.org/drawingml/2006/wordprocessingDrawing" xmlns:w10="urn:schemas-microsoft-com:office:word" xmlns:w="http://schemas.openxmlformats.org/wordprocessingml/2006/main" xmlns:w14="http://schemas.microsoft.com/office/word/2010/wordml" xmlns:w15="http://schemas.microsoft.com/office/word/2012/wordml" xmlns:w16cei="http://schemas.microsoft.com/office/word/2026/wordml/cei" xmlns:w16cex="http://schemas.microsoft.com/office/word/2018/wordml/cex" xmlns:w16cid="http://schemas.microsoft.com/office/word/2016/wordml/cid" xmlns:w16="http://schemas.microsoft.com/office/word/2018/wordml" xmlns:w16du="http://schemas.microsoft.com/office/word/2023/wordml/word16du" xmlns:w16sdtdh="http://schemas.microsoft.com/office/word/2020/wordml/sdtdatahash" xmlns:w16sdtfl="http://schemas.microsoft.com/office/word/2024/wordml/sdtformatlock" xmlns:w16se="http://schemas.microsoft.com/office/word/2015/wordml/symex" xmlns:wpg="http://schemas.microsoft.com/office/word/2010/wordprocessingGroup" xmlns:wpi="http://schemas.microsoft.com/office/word/2010/wordprocessingInk" xmlns:wne="http://schemas.microsoft.com/office/word/2006/wordml" xmlns:wps="http://schemas.microsoft.com/office/word/2010/wordprocessingShape" mc:Ignorable="w14 w15 w16se w16cid w16 w16cex w16sdtdh w16sdtfl w16du wp14">
   <w:body>
     <w:p>
       <w:pPr>
@@ -54,15 +54,7 @@
     </w:p>
     <w:p>
       <w:r>
-        <w:t xml:space="preserve">The Striped Bass App </w:t>
-      </w:r>
-      <w:proofErr w:type="gramStart"/>
-      <w:r>
-        <w:t>is located in</w:t>
-      </w:r>
-      <w:proofErr w:type="gramEnd"/>
-      <w:r>
-        <w:t xml:space="preserve"> two locations: </w:t>
+        <w:t xml:space="preserve">The Striped Bass App is located in two locations: </w:t>
       </w:r>
     </w:p>
     <w:p>
@@ -93,15 +85,7 @@
     </w:p>
     <w:p>
       <w:r>
-        <w:t xml:space="preserve">\Striped-Bass contains </w:t>
-      </w:r>
-      <w:proofErr w:type="gramStart"/>
-      <w:r>
-        <w:t>all of</w:t>
-      </w:r>
-      <w:proofErr w:type="gramEnd"/>
-      <w:r>
-        <w:t xml:space="preserve"> the file organization scripts and dependencies to organize data for the app. \Striped-Bass\Striped-Bass-Habitat-Suitability contains the actual app. </w:t>
+        <w:t xml:space="preserve">\Striped-Bass contains all of the file organization scripts and dependencies to organize data for the app. \Striped-Bass\Striped-Bass-Habitat-Suitability contains the actual app. </w:t>
       </w:r>
     </w:p>
     <w:p>
@@ -153,15 +137,7 @@
         </w:numPr>
       </w:pPr>
       <w:r>
-        <w:t xml:space="preserve">Move all DO and </w:t>
-      </w:r>
-      <w:proofErr w:type="spellStart"/>
-      <w:r>
-        <w:t>WTemp</w:t>
-      </w:r>
-      <w:proofErr w:type="spellEnd"/>
-      <w:r>
-        <w:t xml:space="preserve"> .txt files into \</w:t>
+        <w:t>Move all DO and WTemp .txt files into \</w:t>
       </w:r>
       <w:proofErr w:type="spellStart"/>
       <w:r>
@@ -194,15 +170,7 @@
       </w:r>
       <w:proofErr w:type="spellEnd"/>
       <w:r>
-        <w:t>, YYYY-</w:t>
-      </w:r>
-      <w:proofErr w:type="gramStart"/>
-      <w:r>
-        <w:t>MM(</w:t>
-      </w:r>
-      <w:proofErr w:type="gramEnd"/>
-      <w:r>
-        <w:t xml:space="preserve">-early or -late if in June, July or August). </w:t>
+        <w:t xml:space="preserve">, YYYY-MM(-early or -late if in June, July or August). </w:t>
       </w:r>
     </w:p>
     <w:p>
@@ -214,28 +182,15 @@
         </w:numPr>
       </w:pPr>
       <w:r>
-        <w:t xml:space="preserve">Move </w:t>
-      </w:r>
-      <w:proofErr w:type="gramStart"/>
-      <w:r>
-        <w:t>all .</w:t>
+        <w:t>Move all .</w:t>
       </w:r>
       <w:proofErr w:type="spellStart"/>
       <w:r>
         <w:t>csvs</w:t>
       </w:r>
       <w:proofErr w:type="spellEnd"/>
-      <w:proofErr w:type="gramEnd"/>
-      <w:r>
-        <w:t xml:space="preserve"> </w:t>
-      </w:r>
-      <w:proofErr w:type="gramStart"/>
-      <w:r>
-        <w:t>in  \</w:t>
-      </w:r>
-      <w:proofErr w:type="gramEnd"/>
-      <w:r>
-        <w:t xml:space="preserve">Striped-Bass-Habitat-Suitability into the folder you just created. </w:t>
+      <w:r>
+        <w:t xml:space="preserve"> in  \Striped-Bass-Habitat-Suitability into the folder you just created. </w:t>
       </w:r>
     </w:p>
     <w:p>
@@ -291,6 +246,26 @@
         </w:numPr>
       </w:pPr>
       <w:r>
+        <w:t xml:space="preserve">Delete the old cruise file (BAYXXX.csv). A copy is maintained in </w:t>
+      </w:r>
+      <w:proofErr w:type="spellStart"/>
+      <w:r>
+        <w:t>DataArchive</w:t>
+      </w:r>
+      <w:proofErr w:type="spellEnd"/>
+      <w:r>
+        <w:t xml:space="preserve">. </w:t>
+      </w:r>
+    </w:p>
+    <w:p>
+      <w:pPr>
+        <w:pStyle w:val="ListParagraph"/>
+        <w:numPr>
+          <w:ilvl w:val="0"/>
+          <w:numId w:val="5"/>
+        </w:numPr>
+      </w:pPr>
+      <w:r>
         <w:t>The only data files that should remain in the \Striped-Bass root folder are the following:</w:t>
       </w:r>
     </w:p>
@@ -325,18 +300,13 @@
       </w:r>
       <w:proofErr w:type="spellEnd"/>
       <w:r>
-        <w:t xml:space="preserve"> shape files </w:t>
-      </w:r>
-      <w:proofErr w:type="gramStart"/>
-      <w:r>
-        <w:t>(.</w:t>
+        <w:t xml:space="preserve"> shape files (.</w:t>
       </w:r>
       <w:proofErr w:type="spellStart"/>
       <w:r>
         <w:t>cpg</w:t>
       </w:r>
       <w:proofErr w:type="spellEnd"/>
-      <w:proofErr w:type="gramEnd"/>
       <w:r>
         <w:t>, .</w:t>
       </w:r>
@@ -345,7 +315,6 @@
         <w:t>dbf</w:t>
       </w:r>
       <w:proofErr w:type="spellEnd"/>
-      <w:proofErr w:type="gramStart"/>
       <w:r>
         <w:t>, .</w:t>
       </w:r>
@@ -354,7 +323,6 @@
         <w:t>prj</w:t>
       </w:r>
       <w:proofErr w:type="spellEnd"/>
-      <w:proofErr w:type="gramEnd"/>
       <w:r>
         <w:t>, .</w:t>
       </w:r>
@@ -435,6 +403,7 @@
       </w:pPr>
       <w:proofErr w:type="spellStart"/>
       <w:r>
+        <w:lastRenderedPageBreak/>
         <w:t>percentsuitable_hotspots_currentyear</w:t>
       </w:r>
       <w:proofErr w:type="spellEnd"/>
@@ -449,7 +418,6 @@
       </w:pPr>
       <w:proofErr w:type="spellStart"/>
       <w:r>
-        <w:lastRenderedPageBreak/>
         <w:t>percentsuitable_wholebay_currentyear</w:t>
       </w:r>
       <w:proofErr w:type="spellEnd"/>
@@ -471,36 +439,34 @@
     <w:p>
       <w:pPr>
         <w:pStyle w:val="ListParagraph"/>
+        <w:numPr>
+          <w:ilvl w:val="1"/>
+          <w:numId w:val="5"/>
+        </w:numPr>
+      </w:pPr>
+      <w:proofErr w:type="spellStart"/>
+      <w:r>
+        <w:t>mdsegments</w:t>
+      </w:r>
+      <w:proofErr w:type="spellEnd"/>
+    </w:p>
+    <w:p>
+      <w:pPr>
+        <w:pStyle w:val="ListParagraph"/>
         <w:ind w:left="1440"/>
       </w:pPr>
     </w:p>
     <w:p>
-      <w:proofErr w:type="gramStart"/>
       <w:r>
         <w:rPr>
           <w:u w:val="single"/>
         </w:rPr>
-        <w:t>Current Month</w:t>
-      </w:r>
-      <w:proofErr w:type="gramEnd"/>
-      <w:r>
-        <w:rPr>
-          <w:u w:val="single"/>
-        </w:rPr>
-        <w:t xml:space="preserve"> Cruise Data Organization</w:t>
-      </w:r>
-    </w:p>
-    <w:p>
-      <w:r>
-        <w:t>The Striped Bass App uses three datasheets for each monthly cruise: the formatted cruise file BAYXXX.csv, where XXX is the name of that month’s cruise, as well as the VOL3D interpolator output for Dissolved Oxygen (DO) and Water Temperature in ºF (</w:t>
-      </w:r>
-      <w:proofErr w:type="spellStart"/>
-      <w:r>
-        <w:t>Wtemp</w:t>
-      </w:r>
-      <w:proofErr w:type="spellEnd"/>
-      <w:r>
-        <w:t xml:space="preserve">). </w:t>
+        <w:t>Current Month Cruise Data Organization</w:t>
+      </w:r>
+    </w:p>
+    <w:p>
+      <w:r>
+        <w:t xml:space="preserve">The Striped Bass App uses three datasheets for each monthly cruise: the formatted cruise file BAYXXX.csv, where XXX is the name of that month’s cruise, as well as the VOL3D interpolator output for Dissolved Oxygen (DO) and Water Temperature in ºF (Wtemp). </w:t>
       </w:r>
     </w:p>
     <w:p>
@@ -527,15 +493,7 @@
         <w:t>In the event Andrew is not available</w:t>
       </w:r>
       <w:r>
-        <w:t xml:space="preserve">, you may run the VOL3D interpolator for DO and </w:t>
-      </w:r>
-      <w:proofErr w:type="spellStart"/>
-      <w:r>
-        <w:t>Wtemp</w:t>
-      </w:r>
-      <w:proofErr w:type="spellEnd"/>
-      <w:r>
-        <w:t xml:space="preserve"> yourself. Source the MD Stem, VA Stem, MD </w:t>
+        <w:t xml:space="preserve">, you may run the VOL3D interpolator for DO and Wtemp yourself. Source the MD Stem, VA Stem, MD </w:t>
       </w:r>
       <w:proofErr w:type="spellStart"/>
       <w:r>
@@ -567,22 +525,34 @@
       </w:r>
       <w:proofErr w:type="spellEnd"/>
       <w:r>
-        <w:t xml:space="preserve"> BAYXXX.csv. The .txt DO and </w:t>
-      </w:r>
-      <w:proofErr w:type="spellStart"/>
-      <w:r>
-        <w:t>Wtemp</w:t>
-      </w:r>
-      <w:proofErr w:type="spellEnd"/>
-      <w:r>
-        <w:t xml:space="preserve"> outputs from VOL3D may be moved into the Striped Bass Folder. </w:t>
-      </w:r>
-    </w:p>
-    <w:p>
-      <w:pPr>
-        <w:pStyle w:val="ListParagraph"/>
-        <w:numPr>
-          <w:ilvl w:val="0"/>
+        <w:t xml:space="preserve"> BAYXXX.csv. The .txt DO and Wtemp outputs from VOL3D may be moved into the Striped Bass Folder. </w:t>
+      </w:r>
+    </w:p>
+    <w:p>
+      <w:pPr>
+        <w:pStyle w:val="ListParagraph"/>
+        <w:numPr>
+          <w:ilvl w:val="1"/>
+          <w:numId w:val="3"/>
+        </w:numPr>
+      </w:pPr>
+      <w:r>
+        <w:t xml:space="preserve">As of 2026, all that is needed for the Striped Bass app are the MD Stem and </w:t>
+      </w:r>
+      <w:proofErr w:type="spellStart"/>
+      <w:r>
+        <w:t>tribs</w:t>
+      </w:r>
+      <w:proofErr w:type="spellEnd"/>
+      <w:r>
+        <w:t xml:space="preserve"> files. VA data points aren’t displayed. </w:t>
+      </w:r>
+    </w:p>
+    <w:p>
+      <w:pPr>
+        <w:pStyle w:val="ListParagraph"/>
+        <w:numPr>
+          <w:ilvl w:val="1"/>
           <w:numId w:val="3"/>
         </w:numPr>
       </w:pPr>
@@ -605,15 +575,13 @@
     </w:p>
     <w:p>
       <w:r>
-        <w:t xml:space="preserve">The Striped Bass App also takes historic DO and </w:t>
-      </w:r>
-      <w:proofErr w:type="spellStart"/>
-      <w:r>
-        <w:t>Wtemp</w:t>
-      </w:r>
-      <w:proofErr w:type="spellEnd"/>
-      <w:r>
-        <w:t xml:space="preserve"> data matching the month of the current cruise to create figures that compare this month’s data with previous years. </w:t>
+        <w:t>The Striped Bass App also takes historic DO and Wtemp data matching the month of the current cruise to create figures that compare this month’s data with previous years</w:t>
+      </w:r>
+      <w:r>
+        <w:t xml:space="preserve"> back 10 years</w:t>
+      </w:r>
+      <w:r>
+        <w:t xml:space="preserve">. </w:t>
       </w:r>
     </w:p>
     <w:p>
@@ -625,15 +593,45 @@
         </w:numPr>
       </w:pPr>
       <w:r>
-        <w:t xml:space="preserve">Determine the month of the current cruise. If </w:t>
-      </w:r>
-      <w:proofErr w:type="gramStart"/>
-      <w:r>
-        <w:t>in</w:t>
-      </w:r>
-      <w:proofErr w:type="gramEnd"/>
-      <w:r>
-        <w:t xml:space="preserve"> the summer, determine if the date is in the first half (early) or second half (late) of the month.</w:t>
+        <w:t>Determine the month of the current cruise. If in the summer, determine if the date is in the first half (early) or second half (late) of the month.</w:t>
+      </w:r>
+    </w:p>
+    <w:p>
+      <w:pPr>
+        <w:pStyle w:val="ListParagraph"/>
+        <w:numPr>
+          <w:ilvl w:val="0"/>
+          <w:numId w:val="4"/>
+        </w:numPr>
+      </w:pPr>
+      <w:r>
+        <w:t>Move</w:t>
+      </w:r>
+      <w:r>
+        <w:t xml:space="preserve"> those historic .txt files from \</w:t>
+      </w:r>
+      <w:proofErr w:type="spellStart"/>
+      <w:r>
+        <w:t>WaterQualityDataRepo</w:t>
+      </w:r>
+      <w:proofErr w:type="spellEnd"/>
+      <w:r>
+        <w:t xml:space="preserve"> into the main root folder of the project. If in double cruise months, sometimes the file will be labelled by date, and sometimes the file will be labelled ‘early’/’late’. The name scheme doesn’t matter, just pull the correct files into the directory. </w:t>
+      </w:r>
+      <w:r>
+        <w:t>The earliest file you will need to pull will be 10 years prior to the current year</w:t>
+      </w:r>
+    </w:p>
+    <w:p>
+      <w:pPr>
+        <w:pStyle w:val="ListParagraph"/>
+        <w:numPr>
+          <w:ilvl w:val="1"/>
+          <w:numId w:val="4"/>
+        </w:numPr>
+      </w:pPr>
+      <w:r>
+        <w:t>2026 = 2016 start date</w:t>
       </w:r>
     </w:p>
     <w:p>
@@ -659,6 +657,7 @@
     </w:p>
     <w:p>
       <w:r>
+        <w:lastRenderedPageBreak/>
         <w:t xml:space="preserve">The instructions for running this script are listed in the header of the script and repeated here. </w:t>
       </w:r>
     </w:p>
@@ -683,13 +682,31 @@
         </w:numPr>
       </w:pPr>
       <w:r>
-        <w:t xml:space="preserve">Uncomment lines </w:t>
-      </w:r>
-      <w:r>
-        <w:t>369-371</w:t>
-      </w:r>
-      <w:r>
-        <w:t xml:space="preserve"> on the first run to save the GIS shape files for this month’s cruise. </w:t>
+        <w:t>Make sure</w:t>
+      </w:r>
+      <w:r>
+        <w:t xml:space="preserve"> lines </w:t>
+      </w:r>
+      <w:r>
+        <w:t>3</w:t>
+      </w:r>
+      <w:r>
+        <w:t>58</w:t>
+      </w:r>
+      <w:r>
+        <w:t>-3</w:t>
+      </w:r>
+      <w:r>
+        <w:t>60</w:t>
+      </w:r>
+      <w:r>
+        <w:t xml:space="preserve"> </w:t>
+      </w:r>
+      <w:r>
+        <w:t>are uncommented</w:t>
+      </w:r>
+      <w:r>
+        <w:t xml:space="preserve"> to save the GIS shape files for this month’s cruise. </w:t>
       </w:r>
     </w:p>
     <w:p>
@@ -701,7 +718,10 @@
         </w:numPr>
       </w:pPr>
       <w:r>
-        <w:t xml:space="preserve">Run the script. </w:t>
+        <w:t>Run the script</w:t>
+      </w:r>
+      <w:r>
+        <w:t xml:space="preserve">. </w:t>
       </w:r>
     </w:p>
     <w:p>
@@ -713,23 +733,7 @@
         </w:numPr>
       </w:pPr>
       <w:r>
-        <w:t xml:space="preserve">In the </w:t>
-      </w:r>
-      <w:proofErr w:type="gramStart"/>
-      <w:r>
-        <w:t>figures</w:t>
-      </w:r>
-      <w:proofErr w:type="gramEnd"/>
-      <w:r>
-        <w:t xml:space="preserve"> panels, find either the pie charts for the current month’s cruise, or the stacked bar plots. Locate the percentage of suitable habitat for this </w:t>
-      </w:r>
-      <w:proofErr w:type="gramStart"/>
-      <w:r>
-        <w:t>month, and</w:t>
-      </w:r>
-      <w:proofErr w:type="gramEnd"/>
-      <w:r>
-        <w:t xml:space="preserve"> update the </w:t>
+        <w:t xml:space="preserve">In the figures panels, find either the pie charts for the current month’s cruise, or the stacked bar plots. Locate the percentage of suitable habitat for this month, and update the </w:t>
       </w:r>
       <w:proofErr w:type="spellStart"/>
       <w:r>
@@ -737,15 +741,32 @@
       </w:r>
       <w:proofErr w:type="spellEnd"/>
       <w:r>
-        <w:t xml:space="preserve"> files: hotspots intakes the current month’s hotspot percent suitable habitat (blue) and whole bay intakes the current month’s MD portion of </w:t>
-      </w:r>
-      <w:proofErr w:type="gramStart"/>
-      <w:r>
-        <w:t>the bay</w:t>
-      </w:r>
-      <w:proofErr w:type="gramEnd"/>
-      <w:r>
-        <w:t xml:space="preserve"> suitable habitat (blue). </w:t>
+        <w:t xml:space="preserve"> files: </w:t>
+      </w:r>
+      <w:proofErr w:type="spellStart"/>
+      <w:r>
+        <w:t>percentsuitable_hotspots_currentyear</w:t>
+      </w:r>
+      <w:proofErr w:type="spellEnd"/>
+      <w:r>
+        <w:t xml:space="preserve"> </w:t>
+      </w:r>
+      <w:r>
+        <w:t xml:space="preserve">intakes the current month’s hotspot percent suitable habitat (blue) and </w:t>
+      </w:r>
+      <w:proofErr w:type="spellStart"/>
+      <w:r>
+        <w:t>percentsuitable_wholebay_currentyear</w:t>
+      </w:r>
+      <w:proofErr w:type="spellEnd"/>
+      <w:r>
+        <w:t xml:space="preserve"> </w:t>
+      </w:r>
+      <w:r>
+        <w:t xml:space="preserve">intakes the current month’s MD portion of the bay suitable habitat (blue). </w:t>
+      </w:r>
+      <w:r>
+        <w:t xml:space="preserve">Update the cell in those sheets with the current month’s calculated percentage of suitable habitat. </w:t>
       </w:r>
       <w:r>
         <w:t xml:space="preserve">Save those two </w:t>
@@ -768,33 +789,7 @@
         </w:numPr>
       </w:pPr>
       <w:r>
-        <w:lastRenderedPageBreak/>
-        <w:t xml:space="preserve">All data files necessary for the app will </w:t>
-      </w:r>
-      <w:proofErr w:type="gramStart"/>
-      <w:r>
-        <w:t>save</w:t>
-      </w:r>
-      <w:proofErr w:type="gramEnd"/>
-      <w:r>
-        <w:t xml:space="preserve"> automatically. </w:t>
-      </w:r>
-    </w:p>
-    <w:p>
-      <w:pPr>
-        <w:pStyle w:val="ListParagraph"/>
-        <w:numPr>
-          <w:ilvl w:val="0"/>
-          <w:numId w:val="6"/>
-        </w:numPr>
-      </w:pPr>
-      <w:proofErr w:type="spellStart"/>
-      <w:r>
-        <w:t>Recomment</w:t>
-      </w:r>
-      <w:proofErr w:type="spellEnd"/>
-      <w:r>
-        <w:t xml:space="preserve"> lines 369-371. </w:t>
+        <w:t xml:space="preserve">All data files necessary for the app will save automatically. </w:t>
       </w:r>
     </w:p>
     <w:p>
@@ -819,15 +814,25 @@
         </w:numPr>
       </w:pPr>
       <w:r>
+        <w:t>Copy the cruise file into \Striped-Bass-Habitat-Suitability.</w:t>
+      </w:r>
+    </w:p>
+    <w:p>
+      <w:pPr>
+        <w:pStyle w:val="ListParagraph"/>
+        <w:numPr>
+          <w:ilvl w:val="0"/>
+          <w:numId w:val="9"/>
+        </w:numPr>
+      </w:pPr>
+      <w:r>
         <w:t xml:space="preserve">Open </w:t>
       </w:r>
       <w:proofErr w:type="spellStart"/>
-      <w:proofErr w:type="gramStart"/>
       <w:r>
         <w:t>app.R</w:t>
       </w:r>
       <w:proofErr w:type="spellEnd"/>
-      <w:proofErr w:type="gramEnd"/>
       <w:r>
         <w:t xml:space="preserve"> in \Striped-Bass-Habitat-Suitability. Update line 33 with the current month’s cruise file. If in June, July or August, update</w:t>
       </w:r>
@@ -836,6 +841,26 @@
       </w:r>
       <w:r>
         <w:t xml:space="preserve"> 36 with “Late” or “Early”. If in any other months, leave the “” blank. </w:t>
+      </w:r>
+    </w:p>
+    <w:p>
+      <w:pPr>
+        <w:pStyle w:val="ListParagraph"/>
+        <w:numPr>
+          <w:ilvl w:val="1"/>
+          <w:numId w:val="9"/>
+        </w:numPr>
+      </w:pPr>
+      <w:r>
+        <w:t xml:space="preserve">Note: check whether we’re in a no-data month for 2020 for the stacked bar charts. If we don’t have data, make sure the </w:t>
+      </w:r>
+      <w:proofErr w:type="spellStart"/>
+      <w:r>
+        <w:t>plotly</w:t>
+      </w:r>
+      <w:proofErr w:type="spellEnd"/>
+      <w:r>
+        <w:t xml:space="preserve"> annotations for those charts are uncommented in the script. These should be lines 567-570 and 603-606.</w:t>
       </w:r>
     </w:p>
     <w:p>
@@ -898,15 +923,7 @@
         <w:t>Navigate</w:t>
       </w:r>
       <w:r>
-        <w:t xml:space="preserve"> to the Git Tab in the Environment pane of your RStudio window. There should be </w:t>
-      </w:r>
-      <w:proofErr w:type="gramStart"/>
-      <w:r>
-        <w:t>a number of</w:t>
-      </w:r>
-      <w:proofErr w:type="gramEnd"/>
-      <w:r>
-        <w:t xml:space="preserve"> unchecked boxes—these all correspond to files that have changes. Select all of them. </w:t>
+        <w:t xml:space="preserve"> to the Git Tab in the Environment pane of your RStudio window. There should be a number of unchecked boxes—these all correspond to files that have changes. Select all of them. </w:t>
       </w:r>
     </w:p>
     <w:p>
@@ -930,15 +947,7 @@
         </w:numPr>
       </w:pPr>
       <w:r>
-        <w:t xml:space="preserve">Press ‘Commit’ to commit these changes to Git. Note the commit message </w:t>
-      </w:r>
-      <w:proofErr w:type="gramStart"/>
-      <w:r>
-        <w:t>as ‘(</w:t>
-      </w:r>
-      <w:proofErr w:type="gramEnd"/>
-      <w:r>
-        <w:t xml:space="preserve">late/early) Month Update YYYY’ or similar. </w:t>
+        <w:t xml:space="preserve">Press ‘Commit’ to commit these changes to Git. Note the commit message as ‘(late/early) Month Update YYYY’ or similar. </w:t>
       </w:r>
     </w:p>
     <w:p>
@@ -950,6 +959,7 @@
         </w:numPr>
       </w:pPr>
       <w:r>
+        <w:lastRenderedPageBreak/>
         <w:t>Press ‘Push’ to push these changes to the GitHub branch (</w:t>
       </w:r>
       <w:proofErr w:type="spellStart"/>
@@ -989,15 +999,7 @@
         <w:t xml:space="preserve">Navigate to the GitHub account hosting the </w:t>
       </w:r>
       <w:r>
-        <w:t xml:space="preserve">app and double check it has been updated. The new files will </w:t>
-      </w:r>
-      <w:proofErr w:type="gramStart"/>
-      <w:r>
-        <w:t>show up</w:t>
-      </w:r>
-      <w:proofErr w:type="gramEnd"/>
-      <w:r>
-        <w:t xml:space="preserve"> </w:t>
+        <w:t xml:space="preserve">app and double check it has been updated. The new files will show up </w:t>
       </w:r>
       <w:r>
         <w:t>displaying</w:t>
@@ -1062,7 +1064,7 @@
 </file>
 
 <file path=word/numbering.xml><?xml version="1.0" encoding="utf-8"?>
-<w:numbering xmlns:wpc="http://schemas.microsoft.com/office/word/2010/wordprocessingCanvas" xmlns:cx="http://schemas.microsoft.com/office/drawing/2014/chartex" xmlns:cx1="http://schemas.microsoft.com/office/drawing/2015/9/8/chartex" xmlns:cx2="http://schemas.microsoft.com/office/drawing/2015/10/21/chartex" xmlns:cx3="http://schemas.microsoft.com/office/drawing/2016/5/9/chartex" xmlns:cx4="http://schemas.microsoft.com/office/drawing/2016/5/10/chartex" xmlns:cx5="http://schemas.microsoft.com/office/drawing/2016/5/11/chartex" xmlns:cx6="http://schemas.microsoft.com/office/drawing/2016/5/12/chartex" xmlns:cx7="http://schemas.microsoft.com/office/drawing/2016/5/13/chartex" xmlns:cx8="http://schemas.microsoft.com/office/drawing/2016/5/14/chartex" xmlns:mc="http://schemas.openxmlformats.org/markup-compatibility/2006" xmlns:aink="http://schemas.microsoft.com/office/drawing/2016/ink" xmlns:am3d="http://schemas.microsoft.com/office/drawing/2017/model3d" xmlns:o="urn:schemas-microsoft-com:office:office" xmlns:oel="http://schemas.microsoft.com/office/2019/extlst" xmlns:r="http://schemas.openxmlformats.org/officeDocument/2006/relationships" xmlns:m="http://schemas.openxmlformats.org/officeDocument/2006/math" xmlns:v="urn:schemas-microsoft-com:vml" xmlns:wp14="http://schemas.microsoft.com/office/word/2010/wordprocessingDrawing" xmlns:wp="http://schemas.openxmlformats.org/drawingml/2006/wordprocessingDrawing" xmlns:w10="urn:schemas-microsoft-com:office:word" xmlns:w="http://schemas.openxmlformats.org/wordprocessingml/2006/main" xmlns:w14="http://schemas.microsoft.com/office/word/2010/wordml" xmlns:w15="http://schemas.microsoft.com/office/word/2012/wordml" xmlns:w16cex="http://schemas.microsoft.com/office/word/2018/wordml/cex" xmlns:w16cid="http://schemas.microsoft.com/office/word/2016/wordml/cid" xmlns:w16="http://schemas.microsoft.com/office/word/2018/wordml" xmlns:w16du="http://schemas.microsoft.com/office/word/2023/wordml/word16du" xmlns:w16sdtdh="http://schemas.microsoft.com/office/word/2020/wordml/sdtdatahash" xmlns:w16sdtfl="http://schemas.microsoft.com/office/word/2024/wordml/sdtformatlock" xmlns:w16se="http://schemas.microsoft.com/office/word/2015/wordml/symex" xmlns:wpg="http://schemas.microsoft.com/office/word/2010/wordprocessingGroup" xmlns:wpi="http://schemas.microsoft.com/office/word/2010/wordprocessingInk" xmlns:wne="http://schemas.microsoft.com/office/word/2006/wordml" xmlns:wps="http://schemas.microsoft.com/office/word/2010/wordprocessingShape" mc:Ignorable="w14 w15 w16se w16cid w16 w16cex w16sdtdh w16sdtfl w16du wp14">
+<w:numbering xmlns:wpc="http://schemas.microsoft.com/office/word/2010/wordprocessingCanvas" xmlns:cx="http://schemas.microsoft.com/office/drawing/2014/chartex" xmlns:cx1="http://schemas.microsoft.com/office/drawing/2015/9/8/chartex" xmlns:cx2="http://schemas.microsoft.com/office/drawing/2015/10/21/chartex" xmlns:cx3="http://schemas.microsoft.com/office/drawing/2016/5/9/chartex" xmlns:cx4="http://schemas.microsoft.com/office/drawing/2016/5/10/chartex" xmlns:cx5="http://schemas.microsoft.com/office/drawing/2016/5/11/chartex" xmlns:cx6="http://schemas.microsoft.com/office/drawing/2016/5/12/chartex" xmlns:cx7="http://schemas.microsoft.com/office/drawing/2016/5/13/chartex" xmlns:cx8="http://schemas.microsoft.com/office/drawing/2016/5/14/chartex" xmlns:mc="http://schemas.openxmlformats.org/markup-compatibility/2006" xmlns:aink="http://schemas.microsoft.com/office/drawing/2016/ink" xmlns:am3d="http://schemas.microsoft.com/office/drawing/2017/model3d" xmlns:o="urn:schemas-microsoft-com:office:office" xmlns:oel="http://schemas.microsoft.com/office/2019/extlst" xmlns:r="http://schemas.openxmlformats.org/officeDocument/2006/relationships" xmlns:m="http://schemas.openxmlformats.org/officeDocument/2006/math" xmlns:v="urn:schemas-microsoft-com:vml" xmlns:wp14="http://schemas.microsoft.com/office/word/2010/wordprocessingDrawing" xmlns:wp="http://schemas.openxmlformats.org/drawingml/2006/wordprocessingDrawing" xmlns:w10="urn:schemas-microsoft-com:office:word" xmlns:w="http://schemas.openxmlformats.org/wordprocessingml/2006/main" xmlns:w14="http://schemas.microsoft.com/office/word/2010/wordml" xmlns:w15="http://schemas.microsoft.com/office/word/2012/wordml" xmlns:w16cei="http://schemas.microsoft.com/office/word/2026/wordml/cei" xmlns:w16cex="http://schemas.microsoft.com/office/word/2018/wordml/cex" xmlns:w16cid="http://schemas.microsoft.com/office/word/2016/wordml/cid" xmlns:w16="http://schemas.microsoft.com/office/word/2018/wordml" xmlns:w16du="http://schemas.microsoft.com/office/word/2023/wordml/word16du" xmlns:w16sdtdh="http://schemas.microsoft.com/office/word/2020/wordml/sdtdatahash" xmlns:w16sdtfl="http://schemas.microsoft.com/office/word/2024/wordml/sdtformatlock" xmlns:w16se="http://schemas.microsoft.com/office/word/2015/wordml/symex" xmlns:wpg="http://schemas.microsoft.com/office/word/2010/wordprocessingGroup" xmlns:wpi="http://schemas.microsoft.com/office/word/2010/wordprocessingInk" xmlns:wne="http://schemas.microsoft.com/office/word/2006/wordml" xmlns:wps="http://schemas.microsoft.com/office/word/2010/wordprocessingShape" mc:Ignorable="w14 w15 w16se w16cid w16 w16cex w16sdtdh w16sdtfl w16du wp14">
   <w:abstractNum w:abstractNumId="0" w15:restartNumberingAfterBreak="0">
     <w:nsid w:val="03FB720A"/>
     <w:multiLevelType w:val="hybridMultilevel"/>
@@ -1079,7 +1081,7 @@
         <w:rFonts w:hint="default"/>
       </w:rPr>
     </w:lvl>
-    <w:lvl w:ilvl="1" w:tplc="04090019" w:tentative="1">
+    <w:lvl w:ilvl="1" w:tplc="04090019">
       <w:start w:val="1"/>
       <w:numFmt w:val="lowerLetter"/>
       <w:lvlText w:val="%2."/>
@@ -1524,7 +1526,7 @@
         <w:rFonts w:hint="default"/>
       </w:rPr>
     </w:lvl>
-    <w:lvl w:ilvl="1" w:tplc="04090019" w:tentative="1">
+    <w:lvl w:ilvl="1" w:tplc="04090019">
       <w:start w:val="1"/>
       <w:numFmt w:val="lowerLetter"/>
       <w:lvlText w:val="%2."/>
@@ -1702,7 +1704,7 @@
         <w:rFonts w:hint="default"/>
       </w:rPr>
     </w:lvl>
-    <w:lvl w:ilvl="1" w:tplc="04090019" w:tentative="1">
+    <w:lvl w:ilvl="1" w:tplc="04090019">
       <w:start w:val="1"/>
       <w:numFmt w:val="lowerLetter"/>
       <w:lvlText w:val="%2."/>

</xml_diff>